<commit_message>
Enrich Goettling bullets with tools, hours, and project outcomes
Co-authored-by: Cursor <cursoragent@cursor.com>
</commit_message>
<xml_diff>
--- a/Pedro_Barroso_Data_Analyst.docx
+++ b/Pedro_Barroso_Data_Analyst.docx
@@ -141,7 +141,7 @@
           <w:i w:val="0"/>
           <w:sz w:val="22"/>
         </w:rPr>
-        <w:t>AI / LLM Solutions  |  Python  |  Data Visualization  |  Database Infrastructure  |  Automation  |  Ecommerce Specialist  |  SQL  |  ETL / Pipelines  |  APIs  |  Looker Studio  |  Chatbots  |  Frontend / Web  |  A/B Testing  |  CRM Analytics</w:t>
+        <w:t>AI / LLM Solutions  |  Python  |  Data Visualization  |  Database Infrastructure  |  Automation  |  Ecommerce Specialist  |  SQL  |  ETL / Pipelines  |  APIs  |  Looker Studio  |  n8n  |  ChatGPT API  |  Shopify  |  Frontend / Web  |  A/B Testing  |  CRM Analytics</w:t>
       </w:r>
     </w:p>
     <w:p>
@@ -202,7 +202,7 @@
           <w:i w:val="0"/>
           <w:sz w:val="21"/>
         </w:rPr>
-        <w:t>Built an intelligent WhatsApp solution with AI/LLM automation, streamlining customer conversations and extracting actionable insights from chat data.</w:t>
+        <w:t>Built a WhatsApp automated chatbot with n8n and the ChatGPT API, qualifying leads and filtering 100+ messages a day so only warm opportunities reach the sales pipeline — saving countless hours of manual triage.</w:t>
       </w:r>
     </w:p>
     <w:p>
@@ -217,7 +217,22 @@
           <w:i w:val="0"/>
           <w:sz w:val="21"/>
         </w:rPr>
-        <w:t>Built an automated data-migration robot that transferred and validated 2,010 projects from a legacy system into the new platform, completing ~64 hours of machine processing and replacing ~8 working days of repetitive manual work.</w:t>
+        <w:t>Built an automated data-migration robot with Python and Cursor that transferred and validated 2,010 projects from a legacy system to a new platform, completing ~64 hours of machine processing and replacing ~8 working days of repetitive manual work.</w:t>
+      </w:r>
+    </w:p>
+    <w:p>
+      <w:pPr>
+        <w:pStyle w:val="ListBullet"/>
+        <w:spacing w:after="40" w:before="0"/>
+      </w:pPr>
+      <w:r>
+        <w:rPr>
+          <w:rFonts w:ascii="Calibri" w:hAnsi="Calibri" w:eastAsia="Calibri"/>
+          <w:b w:val="0"/>
+          <w:i w:val="0"/>
+          <w:sz w:val="21"/>
+        </w:rPr>
+        <w:t>Delivered the Occhio Dubai e-commerce storefront end-to-end with Shopify and Claude Code — architecture, UX and conversion flows — live at occhiodubai.ae.</w:t>
       </w:r>
     </w:p>
     <w:p>
@@ -233,21 +248,6 @@
           <w:sz w:val="21"/>
         </w:rPr>
         <w:t>Led the frontend rebuild of the Goettling digital experience (HTML/CSS/JS), shipping interactive product journeys and performance-focused UX.</w:t>
-      </w:r>
-    </w:p>
-    <w:p>
-      <w:pPr>
-        <w:pStyle w:val="ListBullet"/>
-        <w:spacing w:after="40" w:before="0"/>
-      </w:pPr>
-      <w:r>
-        <w:rPr>
-          <w:rFonts w:ascii="Calibri" w:hAnsi="Calibri" w:eastAsia="Calibri"/>
-          <w:b w:val="0"/>
-          <w:i w:val="0"/>
-          <w:sz w:val="21"/>
-        </w:rPr>
-        <w:t>Delivered the full Occhio Dubai e-commerce site end-to-end — storefront, content architecture and conversion flows — live at occhiodubai.ae.</w:t>
       </w:r>
     </w:p>
     <w:p>

</xml_diff>